<commit_message>
fix cung khung bao gia
</commit_message>
<xml_diff>
--- a/BAO GIA MKTT- CLAUDE.docx
+++ b/BAO GIA MKTT- CLAUDE.docx
@@ -5480,6 +5480,7 @@
                 <w:sz w:val="24"/>
               </w:rPr>
             </w:pPr>
+            <w:bookmarkStart w:id="0" w:name="_GoBack" w:colFirst="3" w:colLast="4"/>
             <w:r>
               <w:rPr>
                 <w:spacing w:val="-5"/>
@@ -5911,7 +5912,6 @@
                 <w:sz w:val="24"/>
               </w:rPr>
             </w:pPr>
-            <w:bookmarkStart w:id="0" w:name="_GoBack"/>
             <w:r>
               <w:rPr>
                 <w:b/>
@@ -5940,7 +5940,6 @@
               </w:rPr>
               <w:t>.000đ</w:t>
             </w:r>
-            <w:bookmarkEnd w:id="0"/>
             <w:r>
               <w:rPr>
                 <w:b/>
@@ -5952,6 +5951,7 @@
           </w:p>
         </w:tc>
       </w:tr>
+      <w:bookmarkEnd w:id="0"/>
       <w:tr>
         <w:trPr>
           <w:trHeight w:val="570"/>

</xml_diff>

<commit_message>
bo tich auto resize de khoa khung
</commit_message>
<xml_diff>
--- a/BAO GIA MKTT- CLAUDE.docx
+++ b/BAO GIA MKTT- CLAUDE.docx
@@ -5270,8 +5270,8 @@
         </w:tblBorders>
         <w:tblLayout w:type="fixed"/>
         <w:tblCellMar>
-          <w:left w:w="0" w:type="dxa"/>
-          <w:right w:w="0" w:type="dxa"/>
+          <w:left w:w="72" w:type="dxa"/>
+          <w:right w:w="72" w:type="dxa"/>
         </w:tblCellMar>
         <w:tblLook w:val="01E0" w:firstRow="1" w:lastRow="1" w:firstColumn="1" w:lastColumn="1" w:noHBand="0" w:noVBand="0"/>
       </w:tblPr>
@@ -5480,7 +5480,6 @@
                 <w:sz w:val="24"/>
               </w:rPr>
             </w:pPr>
-            <w:bookmarkStart w:id="0" w:name="_GoBack" w:colFirst="3" w:colLast="4"/>
             <w:r>
               <w:rPr>
                 <w:spacing w:val="-5"/>
@@ -5951,7 +5950,6 @@
           </w:p>
         </w:tc>
       </w:tr>
-      <w:bookmarkEnd w:id="0"/>
       <w:tr>
         <w:trPr>
           <w:trHeight w:val="570"/>
@@ -6908,6 +6906,8 @@
                 <w:sz w:val="24"/>
               </w:rPr>
             </w:pPr>
+            <w:bookmarkStart w:id="0" w:name="_GoBack"/>
+            <w:bookmarkEnd w:id="0"/>
             <w:r>
               <w:rPr>
                 <w:sz w:val="24"/>

</xml_diff>

<commit_message>
khoa cung chieu cao hang exactly
</commit_message>
<xml_diff>
--- a/BAO GIA MKTT- CLAUDE.docx
+++ b/BAO GIA MKTT- CLAUDE.docx
@@ -5276,19 +5276,19 @@
         <w:tblLook w:val="01E0" w:firstRow="1" w:lastRow="1" w:firstColumn="1" w:lastColumn="1" w:noHBand="0" w:noVBand="0"/>
       </w:tblPr>
       <w:tblGrid>
-        <w:gridCol w:w="687"/>
-        <w:gridCol w:w="1714"/>
-        <w:gridCol w:w="2262"/>
-        <w:gridCol w:w="2584"/>
-        <w:gridCol w:w="2886"/>
+        <w:gridCol w:w="616"/>
+        <w:gridCol w:w="1686"/>
+        <w:gridCol w:w="2225"/>
+        <w:gridCol w:w="2541"/>
+        <w:gridCol w:w="2840"/>
       </w:tblGrid>
       <w:tr>
         <w:trPr>
-          <w:trHeight w:val="551"/>
+          <w:trHeight w:hRule="exact" w:val="588"/>
         </w:trPr>
         <w:tc>
           <w:tcPr>
-            <w:tcW w:w="687" w:type="dxa"/>
+            <w:tcW w:w="616" w:type="dxa"/>
           </w:tcPr>
           <w:p>
             <w:pPr>
@@ -5312,7 +5312,7 @@
         </w:tc>
         <w:tc>
           <w:tcPr>
-            <w:tcW w:w="1714" w:type="dxa"/>
+            <w:tcW w:w="1686" w:type="dxa"/>
           </w:tcPr>
           <w:p>
             <w:pPr>
@@ -5344,7 +5344,7 @@
         </w:tc>
         <w:tc>
           <w:tcPr>
-            <w:tcW w:w="2262" w:type="dxa"/>
+            <w:tcW w:w="2225" w:type="dxa"/>
           </w:tcPr>
           <w:p>
             <w:pPr>
@@ -5383,7 +5383,7 @@
         </w:tc>
         <w:tc>
           <w:tcPr>
-            <w:tcW w:w="2584" w:type="dxa"/>
+            <w:tcW w:w="2541" w:type="dxa"/>
           </w:tcPr>
           <w:p>
             <w:pPr>
@@ -5423,7 +5423,7 @@
         </w:tc>
         <w:tc>
           <w:tcPr>
-            <w:tcW w:w="2886" w:type="dxa"/>
+            <w:tcW w:w="2840" w:type="dxa"/>
           </w:tcPr>
           <w:p>
             <w:pPr>
@@ -5464,18 +5464,17 @@
       </w:tr>
       <w:tr>
         <w:trPr>
-          <w:trHeight w:val="441"/>
+          <w:trHeight w:hRule="exact" w:val="588"/>
         </w:trPr>
         <w:tc>
           <w:tcPr>
-            <w:tcW w:w="687" w:type="dxa"/>
+            <w:tcW w:w="616" w:type="dxa"/>
             <w:vMerge w:val="restart"/>
           </w:tcPr>
           <w:p>
             <w:pPr>
               <w:pStyle w:val="TableParagraph"/>
               <w:ind w:left="220"/>
-              <w:jc w:val="left"/>
               <w:rPr>
                 <w:sz w:val="24"/>
               </w:rPr>
@@ -5491,7 +5490,7 @@
         </w:tc>
         <w:tc>
           <w:tcPr>
-            <w:tcW w:w="1714" w:type="dxa"/>
+            <w:tcW w:w="1686" w:type="dxa"/>
             <w:vMerge w:val="restart"/>
           </w:tcPr>
           <w:p>
@@ -5504,6 +5503,8 @@
                 <w:sz w:val="24"/>
               </w:rPr>
             </w:pPr>
+            <w:bookmarkStart w:id="0" w:name="_GoBack"/>
+            <w:bookmarkEnd w:id="0"/>
             <w:r>
               <w:rPr>
                 <w:b/>
@@ -5553,7 +5554,7 @@
         </w:tc>
         <w:tc>
           <w:tcPr>
-            <w:tcW w:w="2262" w:type="dxa"/>
+            <w:tcW w:w="2225" w:type="dxa"/>
           </w:tcPr>
           <w:p>
             <w:pPr>
@@ -5626,13 +5627,12 @@
         </w:tc>
         <w:tc>
           <w:tcPr>
-            <w:tcW w:w="2584" w:type="dxa"/>
+            <w:tcW w:w="2541" w:type="dxa"/>
           </w:tcPr>
           <w:p>
             <w:pPr>
               <w:pStyle w:val="TableParagraph"/>
               <w:ind w:left="537"/>
-              <w:jc w:val="left"/>
               <w:rPr>
                 <w:b/>
                 <w:sz w:val="24"/>
@@ -5682,7 +5682,7 @@
         </w:tc>
         <w:tc>
           <w:tcPr>
-            <w:tcW w:w="2886" w:type="dxa"/>
+            <w:tcW w:w="2840" w:type="dxa"/>
           </w:tcPr>
           <w:p>
             <w:pPr>
@@ -5734,11 +5734,11 @@
       </w:tr>
       <w:tr>
         <w:trPr>
-          <w:trHeight w:val="426"/>
+          <w:trHeight w:hRule="exact" w:val="588"/>
         </w:trPr>
         <w:tc>
           <w:tcPr>
-            <w:tcW w:w="687" w:type="dxa"/>
+            <w:tcW w:w="616" w:type="dxa"/>
             <w:vMerge/>
             <w:tcBorders>
               <w:top w:val="nil"/>
@@ -5755,7 +5755,7 @@
         </w:tc>
         <w:tc>
           <w:tcPr>
-            <w:tcW w:w="1714" w:type="dxa"/>
+            <w:tcW w:w="1686" w:type="dxa"/>
             <w:vMerge/>
             <w:tcBorders>
               <w:top w:val="nil"/>
@@ -5772,7 +5772,7 @@
         </w:tc>
         <w:tc>
           <w:tcPr>
-            <w:tcW w:w="2262" w:type="dxa"/>
+            <w:tcW w:w="2225" w:type="dxa"/>
           </w:tcPr>
           <w:p>
             <w:pPr>
@@ -5845,7 +5845,7 @@
         </w:tc>
         <w:tc>
           <w:tcPr>
-            <w:tcW w:w="2584" w:type="dxa"/>
+            <w:tcW w:w="2541" w:type="dxa"/>
           </w:tcPr>
           <w:p>
             <w:pPr>
@@ -5900,7 +5900,7 @@
         </w:tc>
         <w:tc>
           <w:tcPr>
-            <w:tcW w:w="2886" w:type="dxa"/>
+            <w:tcW w:w="2840" w:type="dxa"/>
           </w:tcPr>
           <w:p>
             <w:pPr>
@@ -5952,11 +5952,11 @@
       </w:tr>
       <w:tr>
         <w:trPr>
-          <w:trHeight w:val="570"/>
+          <w:trHeight w:hRule="exact" w:val="588"/>
         </w:trPr>
         <w:tc>
           <w:tcPr>
-            <w:tcW w:w="687" w:type="dxa"/>
+            <w:tcW w:w="616" w:type="dxa"/>
           </w:tcPr>
           <w:p>
             <w:pPr>
@@ -5977,7 +5977,7 @@
         </w:tc>
         <w:tc>
           <w:tcPr>
-            <w:tcW w:w="3976" w:type="dxa"/>
+            <w:tcW w:w="3911" w:type="dxa"/>
             <w:gridSpan w:val="2"/>
           </w:tcPr>
           <w:p>
@@ -6066,7 +6066,7 @@
         </w:tc>
         <w:tc>
           <w:tcPr>
-            <w:tcW w:w="2584" w:type="dxa"/>
+            <w:tcW w:w="2541" w:type="dxa"/>
             <w:vMerge w:val="restart"/>
           </w:tcPr>
           <w:p>
@@ -6148,7 +6148,7 @@
         </w:tc>
         <w:tc>
           <w:tcPr>
-            <w:tcW w:w="2886" w:type="dxa"/>
+            <w:tcW w:w="2840" w:type="dxa"/>
             <w:vMerge w:val="restart"/>
           </w:tcPr>
           <w:p>
@@ -6239,11 +6239,11 @@
       </w:tr>
       <w:tr>
         <w:trPr>
-          <w:trHeight w:val="580"/>
+          <w:trHeight w:hRule="exact" w:val="588"/>
         </w:trPr>
         <w:tc>
           <w:tcPr>
-            <w:tcW w:w="687" w:type="dxa"/>
+            <w:tcW w:w="616" w:type="dxa"/>
           </w:tcPr>
           <w:p>
             <w:pPr>
@@ -6265,7 +6265,7 @@
         </w:tc>
         <w:tc>
           <w:tcPr>
-            <w:tcW w:w="3976" w:type="dxa"/>
+            <w:tcW w:w="3911" w:type="dxa"/>
             <w:gridSpan w:val="2"/>
           </w:tcPr>
           <w:p>
@@ -6366,7 +6366,7 @@
         </w:tc>
         <w:tc>
           <w:tcPr>
-            <w:tcW w:w="2584" w:type="dxa"/>
+            <w:tcW w:w="2541" w:type="dxa"/>
             <w:vMerge/>
             <w:tcBorders>
               <w:top w:val="nil"/>
@@ -6383,7 +6383,7 @@
         </w:tc>
         <w:tc>
           <w:tcPr>
-            <w:tcW w:w="2886" w:type="dxa"/>
+            <w:tcW w:w="2840" w:type="dxa"/>
             <w:vMerge/>
             <w:tcBorders>
               <w:top w:val="nil"/>
@@ -6401,11 +6401,11 @@
       </w:tr>
       <w:tr>
         <w:trPr>
-          <w:trHeight w:val="551"/>
+          <w:trHeight w:hRule="exact" w:val="588"/>
         </w:trPr>
         <w:tc>
           <w:tcPr>
-            <w:tcW w:w="687" w:type="dxa"/>
+            <w:tcW w:w="616" w:type="dxa"/>
           </w:tcPr>
           <w:p>
             <w:pPr>
@@ -6426,7 +6426,7 @@
         </w:tc>
         <w:tc>
           <w:tcPr>
-            <w:tcW w:w="3976" w:type="dxa"/>
+            <w:tcW w:w="3911" w:type="dxa"/>
             <w:gridSpan w:val="2"/>
           </w:tcPr>
           <w:p>
@@ -6571,7 +6571,7 @@
         </w:tc>
         <w:tc>
           <w:tcPr>
-            <w:tcW w:w="5470" w:type="dxa"/>
+            <w:tcW w:w="5381" w:type="dxa"/>
             <w:gridSpan w:val="2"/>
           </w:tcPr>
           <w:p>
@@ -6647,11 +6647,11 @@
       </w:tr>
       <w:tr>
         <w:trPr>
-          <w:trHeight w:val="830"/>
+          <w:trHeight w:hRule="exact" w:val="588"/>
         </w:trPr>
         <w:tc>
           <w:tcPr>
-            <w:tcW w:w="687" w:type="dxa"/>
+            <w:tcW w:w="616" w:type="dxa"/>
           </w:tcPr>
           <w:p>
             <w:pPr>
@@ -6672,7 +6672,7 @@
         </w:tc>
         <w:tc>
           <w:tcPr>
-            <w:tcW w:w="3976" w:type="dxa"/>
+            <w:tcW w:w="3911" w:type="dxa"/>
             <w:gridSpan w:val="2"/>
           </w:tcPr>
           <w:p>
@@ -6894,7 +6894,7 @@
         </w:tc>
         <w:tc>
           <w:tcPr>
-            <w:tcW w:w="5470" w:type="dxa"/>
+            <w:tcW w:w="5381" w:type="dxa"/>
             <w:gridSpan w:val="2"/>
           </w:tcPr>
           <w:p>
@@ -6906,8 +6906,6 @@
                 <w:sz w:val="24"/>
               </w:rPr>
             </w:pPr>
-            <w:bookmarkStart w:id="0" w:name="_GoBack"/>
-            <w:bookmarkEnd w:id="0"/>
             <w:r>
               <w:rPr>
                 <w:sz w:val="24"/>
@@ -6972,11 +6970,11 @@
       </w:tr>
       <w:tr>
         <w:trPr>
-          <w:trHeight w:val="551"/>
+          <w:trHeight w:hRule="exact" w:val="588"/>
         </w:trPr>
         <w:tc>
           <w:tcPr>
-            <w:tcW w:w="687" w:type="dxa"/>
+            <w:tcW w:w="616" w:type="dxa"/>
           </w:tcPr>
           <w:p>
             <w:pPr>
@@ -6998,7 +6996,7 @@
         </w:tc>
         <w:tc>
           <w:tcPr>
-            <w:tcW w:w="9446" w:type="dxa"/>
+            <w:tcW w:w="9292" w:type="dxa"/>
             <w:gridSpan w:val="4"/>
           </w:tcPr>
           <w:p>

</xml_diff>

<commit_message>
feat: rebuild as client-only PWA quote generator
Replace Express+LibreOffice backend with vanilla HTML/CSS/JS PWA.
Static app, Chrome print-to-PDF, offline-first via service worker.
Zero server, zero cold start, deploy to GitHub Pages.
</commit_message>
<xml_diff>
--- a/BAO GIA MKTT- CLAUDE.docx
+++ b/BAO GIA MKTT- CLAUDE.docx
@@ -5842,10 +5842,16 @@
             <w:pPr>
               <w:pStyle w:val="TableParagraph"/>
               <w:ind w:left="5" w:right="1"/>
+              <w:rPr>
+                <w:sz w:val="20"/>
+                <w:szCs w:val="20"/>
+              </w:rPr>
             </w:pPr>
             <w:r>
               <w:rPr>
                 <w:spacing w:val="-5"/>
+                <w:sz w:val="20"/>
+                <w:szCs w:val="20"/>
               </w:rPr>
               <w:t>02</w:t>
             </w:r>
@@ -5855,6 +5861,199 @@
           <w:tcPr>
             <w:tcW w:w="3821" w:type="dxa"/>
             <w:gridSpan w:val="2"/>
+          </w:tcPr>
+          <w:p>
+            <w:pPr>
+              <w:pStyle w:val="TableParagraph"/>
+              <w:spacing w:before="270" w:line="240" w:lineRule="auto"/>
+              <w:ind w:left="114"/>
+              <w:rPr>
+                <w:sz w:val="20"/>
+                <w:szCs w:val="20"/>
+              </w:rPr>
+            </w:pPr>
+            <w:r>
+              <w:rPr>
+                <w:sz w:val="20"/>
+                <w:szCs w:val="20"/>
+              </w:rPr>
+              <w:t>Bơm</w:t>
+            </w:r>
+            <w:r>
+              <w:rPr>
+                <w:spacing w:val="-2"/>
+                <w:sz w:val="20"/>
+                <w:szCs w:val="20"/>
+              </w:rPr>
+              <w:t xml:space="preserve"> </w:t>
+            </w:r>
+            <w:r>
+              <w:rPr>
+                <w:sz w:val="20"/>
+                <w:szCs w:val="20"/>
+              </w:rPr>
+              <w:t>cột,</w:t>
+            </w:r>
+            <w:r>
+              <w:rPr>
+                <w:spacing w:val="1"/>
+                <w:sz w:val="20"/>
+                <w:szCs w:val="20"/>
+              </w:rPr>
+              <w:t xml:space="preserve"> </w:t>
+            </w:r>
+            <w:r>
+              <w:rPr>
+                <w:sz w:val="20"/>
+                <w:szCs w:val="20"/>
+              </w:rPr>
+              <w:t>vách, đà,</w:t>
+            </w:r>
+            <w:r>
+              <w:rPr>
+                <w:spacing w:val="1"/>
+                <w:sz w:val="20"/>
+                <w:szCs w:val="20"/>
+              </w:rPr>
+              <w:t xml:space="preserve"> </w:t>
+            </w:r>
+            <w:r>
+              <w:rPr>
+                <w:sz w:val="20"/>
+                <w:szCs w:val="20"/>
+              </w:rPr>
+              <w:t>dầm,</w:t>
+            </w:r>
+            <w:r>
+              <w:rPr>
+                <w:spacing w:val="1"/>
+                <w:sz w:val="20"/>
+                <w:szCs w:val="20"/>
+              </w:rPr>
+              <w:t xml:space="preserve"> </w:t>
+            </w:r>
+            <w:r>
+              <w:rPr>
+                <w:sz w:val="20"/>
+                <w:szCs w:val="20"/>
+              </w:rPr>
+              <w:t>thang</w:t>
+            </w:r>
+            <w:r>
+              <w:rPr>
+                <w:spacing w:val="-3"/>
+                <w:sz w:val="20"/>
+                <w:szCs w:val="20"/>
+              </w:rPr>
+              <w:t xml:space="preserve"> </w:t>
+            </w:r>
+            <w:r>
+              <w:rPr>
+                <w:spacing w:val="-4"/>
+                <w:sz w:val="20"/>
+                <w:szCs w:val="20"/>
+              </w:rPr>
+              <w:t>máy…</w:t>
+            </w:r>
+          </w:p>
+        </w:tc>
+        <w:tc>
+          <w:tcPr>
+            <w:tcW w:w="2541" w:type="dxa"/>
+            <w:vMerge w:val="restart"/>
+          </w:tcPr>
+          <w:p>
+            <w:pPr>
+              <w:pStyle w:val="TableParagraph"/>
+              <w:spacing w:before="270" w:line="242" w:lineRule="auto"/>
+              <w:ind w:left="705" w:right="138" w:hanging="548"/>
+              <w:jc w:val="left"/>
+              <w:rPr>
+                <w:sz w:val="20"/>
+                <w:szCs w:val="20"/>
+              </w:rPr>
+            </w:pPr>
+            <w:r>
+              <w:rPr>
+                <w:sz w:val="20"/>
+                <w:szCs w:val="20"/>
+              </w:rPr>
+              <w:t>Đơn</w:t>
+            </w:r>
+            <w:r>
+              <w:rPr>
+                <w:spacing w:val="-8"/>
+                <w:sz w:val="20"/>
+                <w:szCs w:val="20"/>
+              </w:rPr>
+              <w:t xml:space="preserve"> </w:t>
+            </w:r>
+            <w:r>
+              <w:rPr>
+                <w:sz w:val="20"/>
+                <w:szCs w:val="20"/>
+              </w:rPr>
+              <w:t>giá</w:t>
+            </w:r>
+            <w:r>
+              <w:rPr>
+                <w:spacing w:val="-9"/>
+                <w:sz w:val="20"/>
+                <w:szCs w:val="20"/>
+              </w:rPr>
+              <w:t xml:space="preserve"> </w:t>
+            </w:r>
+            <w:r>
+              <w:rPr>
+                <w:sz w:val="20"/>
+                <w:szCs w:val="20"/>
+              </w:rPr>
+              <w:t>trên</w:t>
+            </w:r>
+            <w:r>
+              <w:rPr>
+                <w:spacing w:val="-7"/>
+                <w:sz w:val="20"/>
+                <w:szCs w:val="20"/>
+              </w:rPr>
+              <w:t xml:space="preserve"> </w:t>
+            </w:r>
+            <w:r>
+              <w:rPr>
+                <w:sz w:val="20"/>
+                <w:szCs w:val="20"/>
+              </w:rPr>
+              <w:t>cộng</w:t>
+            </w:r>
+            <w:r>
+              <w:rPr>
+                <w:spacing w:val="-12"/>
+                <w:sz w:val="20"/>
+                <w:szCs w:val="20"/>
+              </w:rPr>
+              <w:t xml:space="preserve"> </w:t>
+            </w:r>
+            <w:r>
+              <w:rPr>
+                <w:sz w:val="20"/>
+                <w:szCs w:val="20"/>
+              </w:rPr>
+              <w:t xml:space="preserve">thêm </w:t>
+            </w:r>
+            <w:r>
+              <w:rPr>
+                <w:spacing w:val="-2"/>
+                <w:sz w:val="20"/>
+                <w:szCs w:val="20"/>
+              </w:rPr>
+              <w:t>500.000đ/ca</w:t>
+            </w:r>
+          </w:p>
+        </w:tc>
+        <w:tc>
+          <w:tcPr>
+            <w:tcW w:w="2840" w:type="dxa"/>
+            <w:vMerge w:val="restart"/>
           </w:tcPr>
           <w:p>
             <w:pPr>
@@ -5862,152 +6061,46 @@
               <w:spacing w:before="270" w:line="240" w:lineRule="auto"/>
               <w:ind w:left="114"/>
               <w:jc w:val="left"/>
-            </w:pPr>
-            <w:r>
-              <w:t>Bơm</w:t>
-            </w:r>
-            <w:r>
-              <w:rPr>
-                <w:spacing w:val="-2"/>
-              </w:rPr>
-              <w:t xml:space="preserve"> </w:t>
-            </w:r>
-            <w:r>
-              <w:t>cột,</w:t>
+              <w:rPr>
+                <w:sz w:val="20"/>
+                <w:szCs w:val="20"/>
+              </w:rPr>
+            </w:pPr>
+            <w:r>
+              <w:rPr>
+                <w:sz w:val="20"/>
+                <w:szCs w:val="20"/>
+              </w:rPr>
+              <w:t>Đơn giá trên</w:t>
             </w:r>
             <w:r>
               <w:rPr>
                 <w:spacing w:val="1"/>
-              </w:rPr>
-              <w:t xml:space="preserve"> </w:t>
-            </w:r>
-            <w:r>
-              <w:t>vách, đà,</w:t>
-            </w:r>
-            <w:r>
-              <w:rPr>
-                <w:spacing w:val="1"/>
-              </w:rPr>
-              <w:t xml:space="preserve"> </w:t>
-            </w:r>
-            <w:r>
-              <w:t>dầm,</w:t>
-            </w:r>
-            <w:r>
-              <w:rPr>
-                <w:spacing w:val="1"/>
-              </w:rPr>
-              <w:t xml:space="preserve"> </w:t>
-            </w:r>
-            <w:r>
-              <w:t>thang</w:t>
+                <w:sz w:val="20"/>
+                <w:szCs w:val="20"/>
+              </w:rPr>
+              <w:t xml:space="preserve"> </w:t>
+            </w:r>
+            <w:r>
+              <w:rPr>
+                <w:sz w:val="20"/>
+                <w:szCs w:val="20"/>
+              </w:rPr>
+              <w:t>cộng</w:t>
             </w:r>
             <w:r>
               <w:rPr>
                 <w:spacing w:val="-3"/>
+                <w:sz w:val="20"/>
+                <w:szCs w:val="20"/>
               </w:rPr>
               <w:t xml:space="preserve"> </w:t>
             </w:r>
             <w:r>
               <w:rPr>
                 <w:spacing w:val="-4"/>
-              </w:rPr>
-              <w:t>máy…</w:t>
-            </w:r>
-          </w:p>
-        </w:tc>
-        <w:tc>
-          <w:tcPr>
-            <w:tcW w:w="2541" w:type="dxa"/>
-            <w:vMerge w:val="restart"/>
-          </w:tcPr>
-          <w:p>
-            <w:pPr>
-              <w:pStyle w:val="TableParagraph"/>
-              <w:spacing w:before="270" w:line="242" w:lineRule="auto"/>
-              <w:ind w:left="705" w:right="138" w:hanging="548"/>
-              <w:jc w:val="left"/>
-            </w:pPr>
-            <w:r>
-              <w:t>Đơn</w:t>
-            </w:r>
-            <w:r>
-              <w:rPr>
-                <w:spacing w:val="-8"/>
-              </w:rPr>
-              <w:t xml:space="preserve"> </w:t>
-            </w:r>
-            <w:r>
-              <w:t>giá</w:t>
-            </w:r>
-            <w:r>
-              <w:rPr>
-                <w:spacing w:val="-9"/>
-              </w:rPr>
-              <w:t xml:space="preserve"> </w:t>
-            </w:r>
-            <w:r>
-              <w:t>trên</w:t>
-            </w:r>
-            <w:r>
-              <w:rPr>
-                <w:spacing w:val="-7"/>
-              </w:rPr>
-              <w:t xml:space="preserve"> </w:t>
-            </w:r>
-            <w:r>
-              <w:t>cộng</w:t>
-            </w:r>
-            <w:r>
-              <w:rPr>
-                <w:spacing w:val="-12"/>
-              </w:rPr>
-              <w:t xml:space="preserve"> </w:t>
-            </w:r>
-            <w:r>
-              <w:t xml:space="preserve">thêm </w:t>
-            </w:r>
-            <w:r>
-              <w:rPr>
-                <w:spacing w:val="-2"/>
-              </w:rPr>
-              <w:t>500.000đ/ca</w:t>
-            </w:r>
-          </w:p>
-        </w:tc>
-        <w:tc>
-          <w:tcPr>
-            <w:tcW w:w="2840" w:type="dxa"/>
-            <w:vMerge w:val="restart"/>
-          </w:tcPr>
-          <w:p>
-            <w:pPr>
-              <w:pStyle w:val="TableParagraph"/>
-              <w:spacing w:before="270" w:line="240" w:lineRule="auto"/>
-              <w:ind w:left="114"/>
-              <w:jc w:val="left"/>
-            </w:pPr>
-            <w:r>
-              <w:t>Đơn giá trên</w:t>
-            </w:r>
-            <w:r>
-              <w:rPr>
-                <w:spacing w:val="1"/>
-              </w:rPr>
-              <w:t xml:space="preserve"> </w:t>
-            </w:r>
-            <w:r>
-              <w:t>cộng</w:t>
-            </w:r>
-            <w:r>
-              <w:rPr>
-                <w:spacing w:val="-3"/>
-              </w:rPr>
-              <w:t xml:space="preserve"> </w:t>
-            </w:r>
-            <w:r>
-              <w:rPr>
-                <w:spacing w:val="-4"/>
+                <w:sz w:val="20"/>
+                <w:szCs w:val="20"/>
               </w:rPr>
               <w:t>thêm</w:t>
             </w:r>
@@ -6020,20 +6113,30 @@
               <w:jc w:val="left"/>
               <w:rPr>
                 <w:position w:val="5"/>
-              </w:rPr>
-            </w:pPr>
-            <w:r>
+                <w:sz w:val="20"/>
+                <w:szCs w:val="20"/>
+              </w:rPr>
+            </w:pPr>
+            <w:r>
+              <w:rPr>
+                <w:sz w:val="20"/>
+                <w:szCs w:val="20"/>
+              </w:rPr>
               <w:t>15.000</w:t>
             </w:r>
             <w:r>
               <w:rPr>
                 <w:spacing w:val="4"/>
+                <w:sz w:val="20"/>
+                <w:szCs w:val="20"/>
               </w:rPr>
               <w:t xml:space="preserve"> </w:t>
             </w:r>
             <w:r>
               <w:rPr>
                 <w:spacing w:val="-4"/>
+                <w:sz w:val="20"/>
+                <w:szCs w:val="20"/>
               </w:rPr>
               <w:t>đ/m</w:t>
             </w:r>
@@ -6041,6 +6144,8 @@
               <w:rPr>
                 <w:spacing w:val="-4"/>
                 <w:position w:val="5"/>
+                <w:sz w:val="20"/>
+                <w:szCs w:val="20"/>
               </w:rPr>
               <w:t>3</w:t>
             </w:r>
@@ -6060,10 +6165,16 @@
               <w:pStyle w:val="TableParagraph"/>
               <w:spacing w:before="11" w:line="240" w:lineRule="auto"/>
               <w:ind w:left="5" w:right="1"/>
+              <w:rPr>
+                <w:sz w:val="20"/>
+                <w:szCs w:val="20"/>
+              </w:rPr>
             </w:pPr>
             <w:r>
               <w:rPr>
                 <w:spacing w:val="-5"/>
+                <w:sz w:val="20"/>
+                <w:szCs w:val="20"/>
               </w:rPr>
               <w:t>03</w:t>
             </w:r>
@@ -6078,69 +6189,107 @@
             <w:pPr>
               <w:pStyle w:val="TableParagraph"/>
               <w:spacing w:before="13" w:line="237" w:lineRule="auto"/>
-              <w:ind w:left="114" w:right="169"/>
-              <w:jc w:val="left"/>
-            </w:pPr>
-            <w:r>
+              <w:ind w:left="284" w:right="169"/>
+              <w:rPr>
+                <w:sz w:val="20"/>
+                <w:szCs w:val="20"/>
+              </w:rPr>
+            </w:pPr>
+            <w:r>
+              <w:rPr>
+                <w:sz w:val="20"/>
+                <w:szCs w:val="20"/>
+              </w:rPr>
               <w:t>Bơm</w:t>
             </w:r>
             <w:r>
               <w:rPr>
                 <w:spacing w:val="-6"/>
-              </w:rPr>
-              <w:t xml:space="preserve"> </w:t>
-            </w:r>
-            <w:r>
+                <w:sz w:val="20"/>
+                <w:szCs w:val="20"/>
+              </w:rPr>
+              <w:t xml:space="preserve"> </w:t>
+            </w:r>
+            <w:r>
+              <w:rPr>
+                <w:sz w:val="20"/>
+                <w:szCs w:val="20"/>
+              </w:rPr>
               <w:t>ngang</w:t>
             </w:r>
             <w:r>
               <w:rPr>
                 <w:spacing w:val="-6"/>
-              </w:rPr>
-              <w:t xml:space="preserve"> </w:t>
-            </w:r>
-            <w:r>
-              <w:t>đ</w:t>
-            </w:r>
-            <w:bookmarkStart w:id="0" w:name="_GoBack"/>
-            <w:bookmarkEnd w:id="0"/>
-            <w:r>
-              <w:t>ường</w:t>
+                <w:sz w:val="20"/>
+                <w:szCs w:val="20"/>
+              </w:rPr>
+              <w:t xml:space="preserve"> </w:t>
+            </w:r>
+            <w:r>
+              <w:rPr>
+                <w:sz w:val="20"/>
+                <w:szCs w:val="20"/>
+              </w:rPr>
+              <w:t>đường</w:t>
             </w:r>
             <w:r>
               <w:rPr>
                 <w:spacing w:val="-6"/>
-              </w:rPr>
-              <w:t xml:space="preserve"> </w:t>
-            </w:r>
-            <w:r>
+                <w:sz w:val="20"/>
+                <w:szCs w:val="20"/>
+              </w:rPr>
+              <w:t xml:space="preserve"> </w:t>
+            </w:r>
+            <w:r>
+              <w:rPr>
+                <w:sz w:val="20"/>
+                <w:szCs w:val="20"/>
+              </w:rPr>
               <w:t>ống</w:t>
             </w:r>
             <w:r>
               <w:rPr>
                 <w:spacing w:val="-6"/>
-              </w:rPr>
-              <w:t xml:space="preserve"> </w:t>
-            </w:r>
-            <w:r>
+                <w:sz w:val="20"/>
+                <w:szCs w:val="20"/>
+              </w:rPr>
+              <w:t xml:space="preserve"> </w:t>
+            </w:r>
+            <w:r>
+              <w:rPr>
+                <w:sz w:val="20"/>
+                <w:szCs w:val="20"/>
+              </w:rPr>
               <w:t>dài</w:t>
             </w:r>
             <w:r>
               <w:rPr>
                 <w:spacing w:val="-5"/>
-              </w:rPr>
-              <w:t xml:space="preserve"> </w:t>
-            </w:r>
-            <w:r>
+                <w:sz w:val="20"/>
+                <w:szCs w:val="20"/>
+              </w:rPr>
+              <w:t xml:space="preserve"> </w:t>
+            </w:r>
+            <w:r>
+              <w:rPr>
+                <w:sz w:val="20"/>
+                <w:szCs w:val="20"/>
+              </w:rPr>
               <w:t>hơn</w:t>
             </w:r>
             <w:r>
               <w:rPr>
                 <w:spacing w:val="-6"/>
-              </w:rPr>
-              <w:t xml:space="preserve"> </w:t>
-            </w:r>
-            <w:r>
+                <w:sz w:val="20"/>
+                <w:szCs w:val="20"/>
+              </w:rPr>
+              <w:t xml:space="preserve"> </w:t>
+            </w:r>
+            <w:r>
+              <w:rPr>
+                <w:sz w:val="20"/>
+                <w:szCs w:val="20"/>
+              </w:rPr>
               <w:t>80m thì cứ mỗi 30m tăng thêm.</w:t>
             </w:r>
           </w:p>
@@ -6153,7 +6302,14 @@
               <w:top w:val="nil"/>
             </w:tcBorders>
           </w:tcPr>
-          <w:p/>
+          <w:p>
+            <w:pPr>
+              <w:rPr>
+                <w:sz w:val="20"/>
+                <w:szCs w:val="20"/>
+              </w:rPr>
+            </w:pPr>
+          </w:p>
         </w:tc>
         <w:tc>
           <w:tcPr>
@@ -6163,7 +6319,14 @@
               <w:top w:val="nil"/>
             </w:tcBorders>
           </w:tcPr>
-          <w:p/>
+          <w:p>
+            <w:pPr>
+              <w:rPr>
+                <w:sz w:val="20"/>
+                <w:szCs w:val="20"/>
+              </w:rPr>
+            </w:pPr>
+          </w:p>
         </w:tc>
       </w:tr>
       <w:tr>
@@ -6178,10 +6341,16 @@
             <w:pPr>
               <w:pStyle w:val="TableParagraph"/>
               <w:ind w:left="5" w:right="1"/>
+              <w:rPr>
+                <w:sz w:val="20"/>
+                <w:szCs w:val="20"/>
+              </w:rPr>
             </w:pPr>
             <w:r>
               <w:rPr>
                 <w:spacing w:val="-5"/>
+                <w:sz w:val="20"/>
+                <w:szCs w:val="20"/>
               </w:rPr>
               <w:t>04</w:t>
             </w:r>
@@ -6196,83 +6365,136 @@
             <w:pPr>
               <w:pStyle w:val="TableParagraph"/>
               <w:ind w:left="114"/>
-              <w:jc w:val="left"/>
-            </w:pPr>
-            <w:r>
+              <w:rPr>
+                <w:sz w:val="20"/>
+                <w:szCs w:val="20"/>
+              </w:rPr>
+            </w:pPr>
+            <w:r>
+              <w:rPr>
+                <w:sz w:val="20"/>
+                <w:szCs w:val="20"/>
+              </w:rPr>
               <w:t>Ca</w:t>
             </w:r>
             <w:r>
               <w:rPr>
                 <w:spacing w:val="-1"/>
-              </w:rPr>
-              <w:t xml:space="preserve"> </w:t>
-            </w:r>
-            <w:r>
+                <w:sz w:val="20"/>
+                <w:szCs w:val="20"/>
+              </w:rPr>
+              <w:t xml:space="preserve"> </w:t>
+            </w:r>
+            <w:r>
+              <w:rPr>
+                <w:sz w:val="20"/>
+                <w:szCs w:val="20"/>
+              </w:rPr>
               <w:t>hoãn,</w:t>
             </w:r>
             <w:r>
               <w:rPr>
                 <w:spacing w:val="3"/>
-              </w:rPr>
-              <w:t xml:space="preserve"> </w:t>
-            </w:r>
-            <w:r>
+                <w:sz w:val="20"/>
+                <w:szCs w:val="20"/>
+              </w:rPr>
+              <w:t xml:space="preserve"> </w:t>
+            </w:r>
+            <w:r>
+              <w:rPr>
+                <w:sz w:val="20"/>
+                <w:szCs w:val="20"/>
+              </w:rPr>
               <w:t>dự phòng,</w:t>
             </w:r>
             <w:r>
               <w:rPr>
                 <w:spacing w:val="3"/>
-              </w:rPr>
-              <w:t xml:space="preserve"> </w:t>
-            </w:r>
-            <w:r>
+                <w:sz w:val="20"/>
+                <w:szCs w:val="20"/>
+              </w:rPr>
+              <w:t xml:space="preserve"> </w:t>
+            </w:r>
+            <w:r>
+              <w:rPr>
+                <w:sz w:val="20"/>
+                <w:szCs w:val="20"/>
+              </w:rPr>
               <w:t>ca</w:t>
             </w:r>
             <w:r>
               <w:rPr>
                 <w:spacing w:val="-1"/>
-              </w:rPr>
-              <w:t xml:space="preserve"> </w:t>
-            </w:r>
-            <w:r>
+                <w:sz w:val="20"/>
+                <w:szCs w:val="20"/>
+              </w:rPr>
+              <w:t xml:space="preserve"> </w:t>
+            </w:r>
+            <w:r>
+              <w:rPr>
+                <w:sz w:val="20"/>
+                <w:szCs w:val="20"/>
+              </w:rPr>
               <w:t>chờ</w:t>
             </w:r>
             <w:r>
               <w:rPr>
                 <w:spacing w:val="-6"/>
-              </w:rPr>
-              <w:t xml:space="preserve"> </w:t>
-            </w:r>
-            <w:r>
+                <w:sz w:val="20"/>
+                <w:szCs w:val="20"/>
+              </w:rPr>
+              <w:t xml:space="preserve"> </w:t>
+            </w:r>
+            <w:r>
+              <w:rPr>
+                <w:sz w:val="20"/>
+                <w:szCs w:val="20"/>
+              </w:rPr>
               <w:t>(</w:t>
             </w:r>
             <w:r>
               <w:rPr>
                 <w:spacing w:val="2"/>
-              </w:rPr>
-              <w:t xml:space="preserve"> </w:t>
-            </w:r>
-            <w:r>
+                <w:sz w:val="20"/>
+                <w:szCs w:val="20"/>
+              </w:rPr>
+              <w:t xml:space="preserve"> </w:t>
+            </w:r>
+            <w:r>
+              <w:rPr>
+                <w:sz w:val="20"/>
+                <w:szCs w:val="20"/>
+              </w:rPr>
               <w:t>chờ</w:t>
             </w:r>
             <w:r>
               <w:rPr>
                 <w:spacing w:val="-1"/>
-              </w:rPr>
-              <w:t xml:space="preserve"> </w:t>
-            </w:r>
-            <w:r>
+                <w:sz w:val="20"/>
+                <w:szCs w:val="20"/>
+              </w:rPr>
+              <w:t xml:space="preserve"> </w:t>
+            </w:r>
+            <w:r>
+              <w:rPr>
+                <w:sz w:val="20"/>
+                <w:szCs w:val="20"/>
+              </w:rPr>
               <w:t>≥</w:t>
             </w:r>
             <w:r>
               <w:rPr>
                 <w:spacing w:val="-1"/>
+                <w:sz w:val="20"/>
+                <w:szCs w:val="20"/>
               </w:rPr>
               <w:t xml:space="preserve"> </w:t>
             </w:r>
             <w:r>
               <w:rPr>
                 <w:spacing w:val="-10"/>
+                <w:sz w:val="20"/>
+                <w:szCs w:val="20"/>
               </w:rPr>
               <w:t>4</w:t>
             </w:r>
@@ -6282,11 +6504,16 @@
               <w:pStyle w:val="TableParagraph"/>
               <w:spacing w:before="2" w:line="257" w:lineRule="exact"/>
               <w:ind w:left="114"/>
-              <w:jc w:val="left"/>
+              <w:rPr>
+                <w:sz w:val="20"/>
+                <w:szCs w:val="20"/>
+              </w:rPr>
             </w:pPr>
             <w:r>
               <w:rPr>
                 <w:spacing w:val="-4"/>
+                <w:sz w:val="20"/>
+                <w:szCs w:val="20"/>
               </w:rPr>
               <w:t>giờ)</w:t>
             </w:r>
@@ -6302,46 +6529,76 @@
               <w:pStyle w:val="TableParagraph"/>
               <w:ind w:left="1713"/>
               <w:jc w:val="left"/>
-            </w:pPr>
-            <w:r>
+              <w:rPr>
+                <w:sz w:val="20"/>
+                <w:szCs w:val="20"/>
+              </w:rPr>
+            </w:pPr>
+            <w:r>
+              <w:rPr>
+                <w:sz w:val="20"/>
+                <w:szCs w:val="20"/>
+              </w:rPr>
               <w:t>Tính</w:t>
             </w:r>
             <w:r>
               <w:rPr>
                 <w:spacing w:val="1"/>
-              </w:rPr>
-              <w:t xml:space="preserve"> </w:t>
-            </w:r>
-            <w:r>
+                <w:sz w:val="20"/>
+                <w:szCs w:val="20"/>
+              </w:rPr>
+              <w:t xml:space="preserve"> </w:t>
+            </w:r>
+            <w:r>
+              <w:rPr>
+                <w:sz w:val="20"/>
+                <w:szCs w:val="20"/>
+              </w:rPr>
               <w:t>bằng</w:t>
             </w:r>
             <w:r>
               <w:rPr>
                 <w:spacing w:val="2"/>
-              </w:rPr>
-              <w:t xml:space="preserve"> </w:t>
-            </w:r>
-            <w:r>
+                <w:sz w:val="20"/>
+                <w:szCs w:val="20"/>
+              </w:rPr>
+              <w:t xml:space="preserve"> </w:t>
+            </w:r>
+            <w:r>
+              <w:rPr>
+                <w:sz w:val="20"/>
+                <w:szCs w:val="20"/>
+              </w:rPr>
               <w:t>01</w:t>
             </w:r>
             <w:r>
               <w:rPr>
                 <w:spacing w:val="-3"/>
-              </w:rPr>
-              <w:t xml:space="preserve"> </w:t>
-            </w:r>
-            <w:r>
+                <w:sz w:val="20"/>
+                <w:szCs w:val="20"/>
+              </w:rPr>
+              <w:t xml:space="preserve"> </w:t>
+            </w:r>
+            <w:r>
+              <w:rPr>
+                <w:sz w:val="20"/>
+                <w:szCs w:val="20"/>
+              </w:rPr>
               <w:t>ca</w:t>
             </w:r>
             <w:r>
               <w:rPr>
                 <w:spacing w:val="1"/>
+                <w:sz w:val="20"/>
+                <w:szCs w:val="20"/>
               </w:rPr>
               <w:t xml:space="preserve"> </w:t>
             </w:r>
             <w:r>
               <w:rPr>
                 <w:spacing w:val="-5"/>
+                <w:sz w:val="20"/>
+                <w:szCs w:val="20"/>
               </w:rPr>
               <w:t>bơm</w:t>
             </w:r>
@@ -6360,10 +6617,16 @@
             <w:pPr>
               <w:pStyle w:val="TableParagraph"/>
               <w:ind w:left="5" w:right="1"/>
+              <w:rPr>
+                <w:sz w:val="20"/>
+                <w:szCs w:val="20"/>
+              </w:rPr>
             </w:pPr>
             <w:r>
               <w:rPr>
                 <w:spacing w:val="-5"/>
+                <w:sz w:val="20"/>
+                <w:szCs w:val="20"/>
               </w:rPr>
               <w:t>05</w:t>
             </w:r>
@@ -6378,65 +6641,106 @@
             <w:pPr>
               <w:pStyle w:val="TableParagraph"/>
               <w:ind w:left="114"/>
-              <w:jc w:val="left"/>
-            </w:pPr>
-            <w:r>
+              <w:rPr>
+                <w:sz w:val="20"/>
+                <w:szCs w:val="20"/>
+              </w:rPr>
+            </w:pPr>
+            <w:r>
+              <w:rPr>
+                <w:sz w:val="20"/>
+                <w:szCs w:val="20"/>
+              </w:rPr>
               <w:t>Những</w:t>
             </w:r>
             <w:r>
               <w:rPr>
                 <w:spacing w:val="-1"/>
-              </w:rPr>
-              <w:t xml:space="preserve"> </w:t>
-            </w:r>
-            <w:r>
+                <w:sz w:val="20"/>
+                <w:szCs w:val="20"/>
+              </w:rPr>
+              <w:t xml:space="preserve"> </w:t>
+            </w:r>
+            <w:r>
+              <w:rPr>
+                <w:sz w:val="20"/>
+                <w:szCs w:val="20"/>
+              </w:rPr>
               <w:t>hạng</w:t>
             </w:r>
             <w:r>
               <w:rPr>
                 <w:spacing w:val="1"/>
-              </w:rPr>
-              <w:t xml:space="preserve"> </w:t>
-            </w:r>
-            <w:r>
+                <w:sz w:val="20"/>
+                <w:szCs w:val="20"/>
+              </w:rPr>
+              <w:t xml:space="preserve"> </w:t>
+            </w:r>
+            <w:r>
+              <w:rPr>
+                <w:sz w:val="20"/>
+                <w:szCs w:val="20"/>
+              </w:rPr>
               <w:t>mục nhỏ</w:t>
             </w:r>
             <w:r>
               <w:rPr>
                 <w:spacing w:val="-3"/>
-              </w:rPr>
-              <w:t xml:space="preserve"> </w:t>
-            </w:r>
-            <w:r>
+                <w:sz w:val="20"/>
+                <w:szCs w:val="20"/>
+              </w:rPr>
+              <w:t xml:space="preserve"> </w:t>
+            </w:r>
+            <w:r>
+              <w:rPr>
+                <w:sz w:val="20"/>
+                <w:szCs w:val="20"/>
+              </w:rPr>
               <w:t>lẽ,</w:t>
             </w:r>
             <w:r>
               <w:rPr>
                 <w:spacing w:val="-2"/>
-              </w:rPr>
-              <w:t xml:space="preserve"> </w:t>
-            </w:r>
-            <w:r>
+                <w:sz w:val="20"/>
+                <w:szCs w:val="20"/>
+              </w:rPr>
+              <w:t xml:space="preserve"> </w:t>
+            </w:r>
+            <w:r>
+              <w:rPr>
+                <w:sz w:val="20"/>
+                <w:szCs w:val="20"/>
+              </w:rPr>
               <w:t>khối</w:t>
             </w:r>
             <w:r>
               <w:rPr>
                 <w:spacing w:val="1"/>
-              </w:rPr>
-              <w:t xml:space="preserve"> </w:t>
-            </w:r>
-            <w:r>
+                <w:sz w:val="20"/>
+                <w:szCs w:val="20"/>
+              </w:rPr>
+              <w:t xml:space="preserve"> </w:t>
+            </w:r>
+            <w:r>
+              <w:rPr>
+                <w:sz w:val="20"/>
+                <w:szCs w:val="20"/>
+              </w:rPr>
               <w:t>lượng</w:t>
             </w:r>
             <w:r>
               <w:rPr>
                 <w:spacing w:val="2"/>
+                <w:sz w:val="20"/>
+                <w:szCs w:val="20"/>
               </w:rPr>
               <w:t xml:space="preserve"> </w:t>
             </w:r>
             <w:r>
               <w:rPr>
                 <w:spacing w:val="-5"/>
+                <w:sz w:val="20"/>
+                <w:szCs w:val="20"/>
               </w:rPr>
               <w:t>ít.</w:t>
             </w:r>
@@ -6445,82 +6749,137 @@
             <w:pPr>
               <w:pStyle w:val="TableParagraph"/>
               <w:spacing w:line="274" w:lineRule="exact"/>
-              <w:ind w:left="114" w:right="169"/>
-              <w:jc w:val="left"/>
-            </w:pPr>
-            <w:r>
+              <w:ind w:left="284" w:right="169"/>
+              <w:rPr>
+                <w:sz w:val="20"/>
+                <w:szCs w:val="20"/>
+              </w:rPr>
+            </w:pPr>
+            <w:r>
+              <w:rPr>
+                <w:sz w:val="20"/>
+                <w:szCs w:val="20"/>
+              </w:rPr>
               <w:t>Nếu</w:t>
             </w:r>
             <w:r>
               <w:rPr>
                 <w:spacing w:val="-3"/>
-              </w:rPr>
-              <w:t xml:space="preserve"> </w:t>
-            </w:r>
-            <w:r>
+                <w:sz w:val="20"/>
+                <w:szCs w:val="20"/>
+              </w:rPr>
+              <w:t xml:space="preserve"> </w:t>
+            </w:r>
+            <w:r>
+              <w:rPr>
+                <w:sz w:val="20"/>
+                <w:szCs w:val="20"/>
+              </w:rPr>
               <w:t>thời</w:t>
             </w:r>
             <w:r>
               <w:rPr>
                 <w:spacing w:val="-3"/>
-              </w:rPr>
-              <w:t xml:space="preserve"> </w:t>
-            </w:r>
-            <w:r>
+                <w:sz w:val="20"/>
+                <w:szCs w:val="20"/>
+              </w:rPr>
+              <w:t xml:space="preserve"> </w:t>
+            </w:r>
+            <w:r>
+              <w:rPr>
+                <w:sz w:val="20"/>
+                <w:szCs w:val="20"/>
+              </w:rPr>
               <w:t>gian</w:t>
             </w:r>
             <w:r>
               <w:rPr>
                 <w:spacing w:val="-4"/>
-              </w:rPr>
-              <w:t xml:space="preserve"> </w:t>
-            </w:r>
-            <w:r>
+                <w:sz w:val="20"/>
+                <w:szCs w:val="20"/>
+              </w:rPr>
+              <w:t xml:space="preserve"> </w:t>
+            </w:r>
+            <w:r>
+              <w:rPr>
+                <w:sz w:val="20"/>
+                <w:szCs w:val="20"/>
+              </w:rPr>
               <w:t>bơm</w:t>
             </w:r>
             <w:r>
               <w:rPr>
                 <w:spacing w:val="-3"/>
-              </w:rPr>
-              <w:t xml:space="preserve"> </w:t>
-            </w:r>
-            <w:r>
+                <w:sz w:val="20"/>
+                <w:szCs w:val="20"/>
+              </w:rPr>
+              <w:t xml:space="preserve"> </w:t>
+            </w:r>
+            <w:r>
+              <w:rPr>
+                <w:sz w:val="20"/>
+                <w:szCs w:val="20"/>
+              </w:rPr>
               <w:t>quá</w:t>
             </w:r>
             <w:r>
               <w:rPr>
                 <w:spacing w:val="-4"/>
-              </w:rPr>
-              <w:t xml:space="preserve"> </w:t>
-            </w:r>
-            <w:r>
+                <w:sz w:val="20"/>
+                <w:szCs w:val="20"/>
+              </w:rPr>
+              <w:t xml:space="preserve"> </w:t>
+            </w:r>
+            <w:r>
+              <w:rPr>
+                <w:sz w:val="20"/>
+                <w:szCs w:val="20"/>
+              </w:rPr>
               <w:t>4</w:t>
             </w:r>
             <w:r>
               <w:rPr>
                 <w:spacing w:val="-8"/>
-              </w:rPr>
-              <w:t xml:space="preserve"> </w:t>
-            </w:r>
-            <w:r>
+                <w:sz w:val="20"/>
+                <w:szCs w:val="20"/>
+              </w:rPr>
+              <w:t xml:space="preserve"> </w:t>
+            </w:r>
+            <w:r>
+              <w:rPr>
+                <w:sz w:val="20"/>
+                <w:szCs w:val="20"/>
+              </w:rPr>
               <w:t>tiếng</w:t>
             </w:r>
             <w:r>
               <w:rPr>
                 <w:spacing w:val="-3"/>
-              </w:rPr>
-              <w:t xml:space="preserve"> </w:t>
-            </w:r>
-            <w:r>
+                <w:sz w:val="20"/>
+                <w:szCs w:val="20"/>
+              </w:rPr>
+              <w:t xml:space="preserve"> </w:t>
+            </w:r>
+            <w:r>
+              <w:rPr>
+                <w:sz w:val="20"/>
+                <w:szCs w:val="20"/>
+              </w:rPr>
               <w:t>kể</w:t>
             </w:r>
             <w:r>
               <w:rPr>
                 <w:spacing w:val="-9"/>
-              </w:rPr>
-              <w:t xml:space="preserve"> </w:t>
-            </w:r>
-            <w:r>
+                <w:sz w:val="20"/>
+                <w:szCs w:val="20"/>
+              </w:rPr>
+              <w:t xml:space="preserve"> </w:t>
+            </w:r>
+            <w:r>
+              <w:rPr>
+                <w:sz w:val="20"/>
+                <w:szCs w:val="20"/>
+              </w:rPr>
               <w:t>từ lúc có bê tông.</w:t>
             </w:r>
           </w:p>
@@ -6535,46 +6894,76 @@
               <w:pStyle w:val="TableParagraph"/>
               <w:ind w:left="1545"/>
               <w:jc w:val="left"/>
-            </w:pPr>
-            <w:r>
+              <w:rPr>
+                <w:sz w:val="20"/>
+                <w:szCs w:val="20"/>
+              </w:rPr>
+            </w:pPr>
+            <w:r>
+              <w:rPr>
+                <w:sz w:val="20"/>
+                <w:szCs w:val="20"/>
+              </w:rPr>
               <w:t>Tính</w:t>
             </w:r>
             <w:r>
               <w:rPr>
                 <w:spacing w:val="1"/>
-              </w:rPr>
-              <w:t xml:space="preserve"> </w:t>
-            </w:r>
-            <w:r>
+                <w:sz w:val="20"/>
+                <w:szCs w:val="20"/>
+              </w:rPr>
+              <w:t xml:space="preserve"> </w:t>
+            </w:r>
+            <w:r>
+              <w:rPr>
+                <w:sz w:val="20"/>
+                <w:szCs w:val="20"/>
+              </w:rPr>
               <w:t>thêm</w:t>
             </w:r>
             <w:r>
               <w:rPr>
                 <w:spacing w:val="-4"/>
-              </w:rPr>
-              <w:t xml:space="preserve"> </w:t>
-            </w:r>
-            <w:r>
+                <w:sz w:val="20"/>
+                <w:szCs w:val="20"/>
+              </w:rPr>
+              <w:t xml:space="preserve"> </w:t>
+            </w:r>
+            <w:r>
+              <w:rPr>
+                <w:sz w:val="20"/>
+                <w:szCs w:val="20"/>
+              </w:rPr>
               <w:t>1</w:t>
             </w:r>
             <w:r>
               <w:rPr>
                 <w:spacing w:val="2"/>
-              </w:rPr>
-              <w:t xml:space="preserve"> </w:t>
-            </w:r>
-            <w:r>
+                <w:sz w:val="20"/>
+                <w:szCs w:val="20"/>
+              </w:rPr>
+              <w:t xml:space="preserve"> </w:t>
+            </w:r>
+            <w:r>
+              <w:rPr>
+                <w:sz w:val="20"/>
+                <w:szCs w:val="20"/>
+              </w:rPr>
               <w:t>ca bơm</w:t>
             </w:r>
             <w:r>
               <w:rPr>
                 <w:spacing w:val="-2"/>
+                <w:sz w:val="20"/>
+                <w:szCs w:val="20"/>
               </w:rPr>
               <w:t xml:space="preserve"> </w:t>
             </w:r>
             <w:r>
               <w:rPr>
                 <w:spacing w:val="-5"/>
+                <w:sz w:val="20"/>
+                <w:szCs w:val="20"/>
               </w:rPr>
               <w:t>mới</w:t>
             </w:r>
@@ -6594,10 +6983,16 @@
               <w:pStyle w:val="TableParagraph"/>
               <w:spacing w:before="270" w:line="261" w:lineRule="exact"/>
               <w:ind w:left="5" w:right="1"/>
+              <w:rPr>
+                <w:sz w:val="20"/>
+                <w:szCs w:val="20"/>
+              </w:rPr>
             </w:pPr>
             <w:r>
               <w:rPr>
                 <w:spacing w:val="-5"/>
+                <w:sz w:val="20"/>
+                <w:szCs w:val="20"/>
               </w:rPr>
               <w:t>06</w:t>
             </w:r>
@@ -6612,163 +7007,275 @@
             <w:pPr>
               <w:pStyle w:val="TableParagraph"/>
               <w:spacing w:line="274" w:lineRule="exact"/>
-              <w:ind w:left="114" w:right="391"/>
+              <w:ind w:left="194" w:right="391"/>
               <w:jc w:val="left"/>
-            </w:pPr>
-            <w:r>
+              <w:rPr>
+                <w:sz w:val="20"/>
+                <w:szCs w:val="20"/>
+              </w:rPr>
+            </w:pPr>
+            <w:r>
+              <w:rPr>
+                <w:sz w:val="20"/>
+                <w:szCs w:val="20"/>
+              </w:rPr>
               <w:t>Trường</w:t>
             </w:r>
             <w:r>
               <w:rPr>
                 <w:spacing w:val="-2"/>
-              </w:rPr>
-              <w:t xml:space="preserve"> </w:t>
-            </w:r>
-            <w:r>
+                <w:sz w:val="20"/>
+                <w:szCs w:val="20"/>
+              </w:rPr>
+              <w:t xml:space="preserve"> </w:t>
+            </w:r>
+            <w:r>
+              <w:rPr>
+                <w:sz w:val="20"/>
+                <w:szCs w:val="20"/>
+              </w:rPr>
               <w:t>hợp</w:t>
             </w:r>
             <w:r>
               <w:rPr>
                 <w:spacing w:val="-2"/>
-              </w:rPr>
-              <w:t xml:space="preserve"> </w:t>
-            </w:r>
-            <w:r>
+                <w:sz w:val="20"/>
+                <w:szCs w:val="20"/>
+              </w:rPr>
+              <w:t xml:space="preserve"> </w:t>
+            </w:r>
+            <w:r>
+              <w:rPr>
+                <w:sz w:val="20"/>
+                <w:szCs w:val="20"/>
+              </w:rPr>
               <w:t>bơm( bơm</w:t>
             </w:r>
             <w:r>
               <w:rPr>
                 <w:spacing w:val="-6"/>
-              </w:rPr>
-              <w:t xml:space="preserve"> </w:t>
-            </w:r>
-            <w:r>
+                <w:sz w:val="20"/>
+                <w:szCs w:val="20"/>
+              </w:rPr>
+              <w:t xml:space="preserve"> </w:t>
+            </w:r>
+            <w:r>
+              <w:rPr>
+                <w:sz w:val="20"/>
+                <w:szCs w:val="20"/>
+              </w:rPr>
               <w:t>cần</w:t>
             </w:r>
             <w:r>
               <w:rPr>
                 <w:spacing w:val="-2"/>
-              </w:rPr>
-              <w:t xml:space="preserve"> </w:t>
-            </w:r>
-            <w:r>
+                <w:sz w:val="20"/>
+                <w:szCs w:val="20"/>
+              </w:rPr>
+              <w:t xml:space="preserve"> </w:t>
+            </w:r>
+            <w:bookmarkStart w:id="0" w:name="_GoBack"/>
+            <w:bookmarkEnd w:id="0"/>
+            <w:r>
+              <w:rPr>
+                <w:sz w:val="20"/>
+                <w:szCs w:val="20"/>
+              </w:rPr>
               <w:t>hoặc</w:t>
             </w:r>
             <w:r>
               <w:rPr>
                 <w:spacing w:val="-3"/>
-              </w:rPr>
-              <w:t xml:space="preserve"> </w:t>
-            </w:r>
-            <w:r>
+                <w:sz w:val="20"/>
+                <w:szCs w:val="20"/>
+              </w:rPr>
+              <w:t xml:space="preserve"> </w:t>
+            </w:r>
+            <w:r>
+              <w:rPr>
+                <w:sz w:val="20"/>
+                <w:szCs w:val="20"/>
+              </w:rPr>
               <w:t>bơm</w:t>
             </w:r>
             <w:r>
               <w:rPr>
                 <w:spacing w:val="-2"/>
-              </w:rPr>
-              <w:t xml:space="preserve"> </w:t>
-            </w:r>
-            <w:r>
+                <w:sz w:val="20"/>
+                <w:szCs w:val="20"/>
+              </w:rPr>
+              <w:t xml:space="preserve"> </w:t>
+            </w:r>
+            <w:r>
+              <w:rPr>
+                <w:sz w:val="20"/>
+                <w:szCs w:val="20"/>
+              </w:rPr>
               <w:t>ngang)</w:t>
             </w:r>
             <w:r>
               <w:rPr>
                 <w:spacing w:val="-4"/>
-              </w:rPr>
-              <w:t xml:space="preserve"> </w:t>
-            </w:r>
-            <w:r>
+                <w:sz w:val="20"/>
+                <w:szCs w:val="20"/>
+              </w:rPr>
+              <w:t xml:space="preserve"> </w:t>
+            </w:r>
+            <w:r>
+              <w:rPr>
+                <w:sz w:val="20"/>
+                <w:szCs w:val="20"/>
+              </w:rPr>
               <w:t>đã</w:t>
             </w:r>
             <w:r>
               <w:rPr>
                 <w:spacing w:val="-3"/>
-              </w:rPr>
-              <w:t xml:space="preserve"> </w:t>
-            </w:r>
-            <w:r>
+                <w:sz w:val="20"/>
+                <w:szCs w:val="20"/>
+              </w:rPr>
+              <w:t xml:space="preserve"> </w:t>
+            </w:r>
+            <w:r>
+              <w:rPr>
+                <w:sz w:val="20"/>
+                <w:szCs w:val="20"/>
+              </w:rPr>
               <w:t>tới</w:t>
             </w:r>
             <w:r>
               <w:rPr>
                 <w:spacing w:val="-2"/>
-              </w:rPr>
-              <w:t xml:space="preserve"> </w:t>
-            </w:r>
-            <w:r>
+                <w:sz w:val="20"/>
+                <w:szCs w:val="20"/>
+              </w:rPr>
+              <w:t xml:space="preserve"> </w:t>
+            </w:r>
+            <w:r>
+              <w:rPr>
+                <w:sz w:val="20"/>
+                <w:szCs w:val="20"/>
+              </w:rPr>
               <w:t>đặt</w:t>
             </w:r>
             <w:r>
               <w:rPr>
                 <w:spacing w:val="-2"/>
-              </w:rPr>
-              <w:t xml:space="preserve"> </w:t>
-            </w:r>
-            <w:r>
+                <w:sz w:val="20"/>
+                <w:szCs w:val="20"/>
+              </w:rPr>
+              <w:t xml:space="preserve"> </w:t>
+            </w:r>
+            <w:r>
+              <w:rPr>
+                <w:sz w:val="20"/>
+                <w:szCs w:val="20"/>
+              </w:rPr>
               <w:t>tại</w:t>
             </w:r>
             <w:r>
               <w:rPr>
                 <w:spacing w:val="-6"/>
-              </w:rPr>
-              <w:t xml:space="preserve"> </w:t>
-            </w:r>
-            <w:r>
+                <w:sz w:val="20"/>
+                <w:szCs w:val="20"/>
+              </w:rPr>
+              <w:t xml:space="preserve"> </w:t>
+            </w:r>
+            <w:r>
+              <w:rPr>
+                <w:sz w:val="20"/>
+                <w:szCs w:val="20"/>
+              </w:rPr>
               <w:t>công</w:t>
             </w:r>
             <w:r>
               <w:rPr>
                 <w:spacing w:val="-2"/>
-              </w:rPr>
-              <w:t xml:space="preserve"> </w:t>
-            </w:r>
-            <w:r>
+                <w:sz w:val="20"/>
+                <w:szCs w:val="20"/>
+              </w:rPr>
+              <w:t xml:space="preserve"> </w:t>
+            </w:r>
+            <w:r>
+              <w:rPr>
+                <w:sz w:val="20"/>
+                <w:szCs w:val="20"/>
+              </w:rPr>
               <w:t>trường</w:t>
             </w:r>
             <w:r>
               <w:rPr>
                 <w:spacing w:val="-2"/>
-              </w:rPr>
-              <w:t xml:space="preserve"> </w:t>
-            </w:r>
-            <w:r>
+                <w:sz w:val="20"/>
+                <w:szCs w:val="20"/>
+              </w:rPr>
+              <w:t xml:space="preserve"> </w:t>
+            </w:r>
+            <w:r>
+              <w:rPr>
+                <w:sz w:val="20"/>
+                <w:szCs w:val="20"/>
+              </w:rPr>
               <w:t>mà</w:t>
             </w:r>
             <w:r>
               <w:rPr>
                 <w:spacing w:val="-7"/>
-              </w:rPr>
-              <w:t xml:space="preserve"> </w:t>
-            </w:r>
-            <w:r>
+                <w:sz w:val="20"/>
+                <w:szCs w:val="20"/>
+              </w:rPr>
+              <w:t xml:space="preserve"> </w:t>
+            </w:r>
+            <w:r>
+              <w:rPr>
+                <w:sz w:val="20"/>
+                <w:szCs w:val="20"/>
+              </w:rPr>
               <w:t>dời</w:t>
             </w:r>
             <w:r>
               <w:rPr>
                 <w:spacing w:val="-2"/>
-              </w:rPr>
-              <w:t xml:space="preserve"> </w:t>
-            </w:r>
-            <w:r>
+                <w:sz w:val="20"/>
+                <w:szCs w:val="20"/>
+              </w:rPr>
+              <w:t xml:space="preserve"> </w:t>
+            </w:r>
+            <w:r>
+              <w:rPr>
+                <w:sz w:val="20"/>
+                <w:szCs w:val="20"/>
+              </w:rPr>
               <w:t>bơm</w:t>
             </w:r>
             <w:r>
               <w:rPr>
                 <w:spacing w:val="-2"/>
-              </w:rPr>
-              <w:t xml:space="preserve"> </w:t>
-            </w:r>
-            <w:r>
+                <w:sz w:val="20"/>
+                <w:szCs w:val="20"/>
+              </w:rPr>
+              <w:t xml:space="preserve"> </w:t>
+            </w:r>
+            <w:r>
+              <w:rPr>
+                <w:sz w:val="20"/>
+                <w:szCs w:val="20"/>
+              </w:rPr>
               <w:t>theo</w:t>
             </w:r>
             <w:r>
               <w:rPr>
                 <w:spacing w:val="-7"/>
-              </w:rPr>
-              <w:t xml:space="preserve"> </w:t>
-            </w:r>
-            <w:r>
+                <w:sz w:val="20"/>
+                <w:szCs w:val="20"/>
+              </w:rPr>
+              <w:t xml:space="preserve"> </w:t>
+            </w:r>
+            <w:r>
+              <w:rPr>
+                <w:sz w:val="20"/>
+                <w:szCs w:val="20"/>
+              </w:rPr>
               <w:t>yêu cầu của bên mua thì ngoài đơn giá bơm phải trả, mỗi lần dời bơm sẽ tính thêm 01 ca bơm.</w:t>
             </w:r>
           </w:p>

</xml_diff>